<commit_message>
feat(gates,merge-service,docs): CM-NO-FAIL-OPEN-SKIP gate (BOB-161), merge off event loop (BOB-137 source fix, item stays open for live soak), AGENTS.md Go-profile port fix (BOB-232)
BOB-161: new pre-build invariant 57 with AST analyzer, set-based baseline of 10 fail-open skips, harness with golden-TRUE/FALSE + paired mutations.
BOB-137: Deduplicator.merge_results now runs via asyncio.to_thread in search and SSE paths; instance-state race removed; 6 RED->GREEN tests. Live soak still owed.
BOB-232: AGENTS.md states Go profile serves 7187 only.
BOB-164 closure evidence recorded, item open pending live axe scan.

Co-Authored-By: Claude Sonnet 5 <noreply@anthropic.com>
</commit_message>
<xml_diff>
--- a/AGENTS.docx
+++ b/AGENTS.docx
@@ -1677,7 +1677,7 @@
               <w:pStyle w:val="Compact"/>
             </w:pPr>
             <w:r>
-              <w:t xml:space="preserve">7186, 7187, 7188</w:t>
+              <w:t xml:space="preserve">7187</w:t>
             </w:r>
           </w:p>
         </w:tc>
@@ -1700,7 +1700,19 @@
               <w:t xml:space="preserve">--profile go</w:t>
             </w:r>
             <w:r>
-              <w:t xml:space="preserve">; replaces Python proxy</w:t>
+              <w:t xml:space="preserve">; serves the merge service on 7187 only (single binary,</w:t>
+            </w:r>
+            <w:r>
+              <w:t xml:space="preserve"> </w:t>
+            </w:r>
+            <w:r>
+              <w:rPr>
+                <w:rStyle w:val="VerbatimChar"/>
+              </w:rPr>
+              <w:t xml:space="preserve">MERGE_SERVICE_PORT</w:t>
+            </w:r>
+            <w:r>
+              <w:t xml:space="preserve">); does NOT bind 7186 or 7188 — see BOB-141</w:t>
             </w:r>
           </w:p>
         </w:tc>

</xml_diff>